<commit_message>
Added the correct docx file
</commit_message>
<xml_diff>
--- a/thesis/data/fold_C_vs_Rust.docx
+++ b/thesis/data/fold_C_vs_Rust.docx
@@ -724,7 +724,7 @@
           <w:p>
             <w:pPr/>
             <w:r>
-              <w:t xml:space="preserve">Μαζική επεξεργασία απλού ASCII</w:t>
+              <w:t xml:space="preserve">Επεξεργασία συνεχόμενων ASCII χαρακτήρων μαζί (443: εύρεση του τέλους, 466: κόψιμο σε κομμάτια που χωράνε στο πλάτος)</w:t>
             </w:r>
           </w:p>
         </w:tc>
@@ -958,7 +958,16 @@
         <w:t xml:space="preserve">system.h</w:t>
       </w:r>
       <w:r>
-        <w:t xml:space="preserve"> (κείμενο βοήθειας), κοινά σε όλα τα εργαλεία, που δεν μετρούν τα παραπάνω.</w:t>
+        <w:t xml:space="preserve"> (κείμενο βοήθειας), κοινά σε όλα τα εργαλεία, που δεν μετρούν τα παραπάνω. Οι αριθμοί γραμμών είναι αυτοί του IR: τα loops 198 (C) και 410, 551, 706, 226 (Rust) ξεκινούν στις γραμμές 195 (ετικέτα </w:t>
+      </w:r>
+      <w:r>
+        <w:rPr>
+          <w:rStyle w:val="CodeChar"/>
+        </w:rPr>
+        <w:t xml:space="preserve">rescan</w:t>
+      </w:r>
+      <w:r>
+        <w:t xml:space="preserve">), 408, 549, 704 και 220 του κώδικα.</w:t>
       </w:r>
     </w:p>
     <w:p>
@@ -1277,16 +1286,34 @@
         <w:t xml:space="preserve">Loops της βιβλιοθήκης:</w:t>
       </w:r>
       <w:r>
-        <w:t xml:space="preserve"> η Rust έχει επιπλέον 15 loops στην τυπική βιβλιοθήκη: 7 αναζητήσεις σε bytes (π.χ. </w:t>
+        <w:t xml:space="preserve"> η Rust έχει επιπλέον 15 loops στην τυπική βιβλιοθήκη: 7 σαρώσεις bytes (4 από μία μόνο κλήση </w:t>
       </w:r>
       <w:r>
         <w:rPr>
           <w:rStyle w:val="CodeChar"/>
         </w:rPr>
+        <w:t xml:space="preserve">is_ascii</w:t>
+      </w:r>
+      <w:r>
+        <w:t xml:space="preserve"> στη γραμμή 497, 2 </w:t>
+      </w:r>
+      <w:r>
+        <w:rPr>
+          <w:rStyle w:val="CodeChar"/>
+        </w:rPr>
         <w:t xml:space="preserve">rposition</w:t>
       </w:r>
       <w:r>
-        <w:t xml:space="preserve"> για το τελευταίο κενό), 5 για τα ορίσματα (μαζί με το clap) και 3 για I/O. Η C δεν έχει κανένα, γιατί ο κώδικας της libc δεν είναι μέσα στο IR.</w:t>
+        <w:t xml:space="preserve"> για το τελευταίο κενό, 1 </w:t>
+      </w:r>
+      <w:r>
+        <w:rPr>
+          <w:rStyle w:val="CodeChar"/>
+        </w:rPr>
+        <w:t xml:space="preserve">position</w:t>
+      </w:r>
+      <w:r>
+        <w:t xml:space="preserve"> για newline), 5 για τα ορίσματα (μαζί με το clap) και 3 για I/O. Η C δεν έχει κανένα, γιατί ο κώδικας της libc δεν είναι μέσα στο IR.</w:t>
       </w:r>
     </w:p>
     <w:p>
@@ -1739,7 +1766,7 @@
         <w:t xml:space="preserve">Άλλος σχεδιασμός των loops:</w:t>
       </w:r>
       <w:r>
-        <w:t xml:space="preserve"> η C έχει ένα γενικό loop χαρακτήρων και αφήνει την ανάγνωση και το UTF-8 στο gnulib. Η Rust έχει ξεχωριστό loop για κάθε είδος εισόδου και κάνει αυτές τις δουλειές στον δικό της κώδικα.</w:t>
+        <w:t xml:space="preserve"> η C έχει ένα γενικό loop χαρακτήρων και αφήνει την ανάγνωση και το UTF-8 στο gnulib. Η Rust έχει ξεχωριστό loop για κάθε είδος εισόδου· η ανάγνωση σε κομμάτια και τα όρια UTF-8 γίνονται σε loops του δικού της κώδικα, ενώ η αποκωδικοποίηση γίνεται στην τυπική βιβλιοθήκη (όπως στη C στο gnulib).</w:t>
       </w:r>
     </w:p>
     <w:p>

</xml_diff>